<commit_message>
Starting on trees and ending 2048
</commit_message>
<xml_diff>
--- a/2048/2048_Project2.docx
+++ b/2048/2048_Project2.docx
@@ -60,12 +60,12 @@
     <w:p>
       <w:pPr>
         <w:rPr>
-          <w:lang w:val="fi-FI"/>
+          <w:lang w:val="en-GB"/>
         </w:rPr>
       </w:pPr>
       <w:r>
         <w:rPr>
-          <w:lang w:val="fi-FI"/>
+          <w:lang w:val="en-GB"/>
         </w:rPr>
         <w:t>Responsibilities:</w:t>
       </w:r>
@@ -100,11 +100,19 @@
         </w:rPr>
         <w:t xml:space="preserve"> points direction heuristic, </w:t>
       </w:r>
-      <w:r>
-        <w:rPr>
-          <w:lang w:val="en-GB"/>
-        </w:rPr>
-        <w:t xml:space="preserve">Penalize distance heuristic, </w:t>
+      <w:proofErr w:type="gramStart"/>
+      <w:r>
+        <w:rPr>
+          <w:lang w:val="en-GB"/>
+        </w:rPr>
+        <w:t>Penalize</w:t>
+      </w:r>
+      <w:proofErr w:type="gramEnd"/>
+      <w:r>
+        <w:rPr>
+          <w:lang w:val="en-GB"/>
+        </w:rPr>
+        <w:t xml:space="preserve"> distance heuristic, </w:t>
       </w:r>
       <w:r>
         <w:rPr>
@@ -167,11 +175,6 @@
       </w:r>
     </w:p>
     <w:p>
-      <w:pPr>
-        <w:rPr>
-          <w:lang w:val="en-FI"/>
-        </w:rPr>
-      </w:pPr>
       <w:r>
         <w:rPr>
           <w:lang w:val="en-GB"/>
@@ -182,7 +185,19 @@
         <w:rPr>
           <w:lang w:val="en-GB"/>
         </w:rPr>
-        <w:t xml:space="preserve"> we made the Calculate chance definition work and calculate the chances for the tile 2 and tile 4 to appear in the possible_boards. After which we started on heuristics.</w:t>
+        <w:t xml:space="preserve"> we made the Calculate chance definition work and calculate the chances for the tile 2 and tile 4 to appear in the </w:t>
+      </w:r>
+      <w:r>
+        <w:rPr>
+          <w:lang w:val="en-GB"/>
+        </w:rPr>
+        <w:t>possible boards</w:t>
+      </w:r>
+      <w:r>
+        <w:rPr>
+          <w:lang w:val="en-GB"/>
+        </w:rPr>
+        <w:t>. After which we started on heuristics.</w:t>
       </w:r>
       <w:r>
         <w:rPr>
@@ -222,43 +237,25 @@
         <w:t xml:space="preserve"> turned to have a negative effect on the high score created by using only </w:t>
       </w:r>
       <w:r>
-        <w:rPr>
-          <w:lang w:val="en-FI"/>
-        </w:rPr>
         <w:t>HighestValueDirection</w:t>
       </w:r>
       <w:r>
-        <w:rPr>
-          <w:lang w:val="en-FI"/>
-        </w:rPr>
         <w:t xml:space="preserve"> heuristic</w:t>
       </w:r>
       <w:r>
-        <w:rPr>
-          <w:lang w:val="en-FI"/>
-        </w:rPr>
         <w:t xml:space="preserve"> along with Penalize distance heuristic.</w:t>
       </w:r>
     </w:p>
     <w:p>
       <w:pPr>
         <w:pStyle w:val="Heading2"/>
-        <w:rPr>
-          <w:lang w:val="en-FI"/>
-        </w:rPr>
       </w:pPr>
     </w:p>
     <w:p>
       <w:pPr>
         <w:pStyle w:val="Heading2"/>
-        <w:rPr>
-          <w:lang w:val="en-FI"/>
-        </w:rPr>
       </w:pPr>
       <w:r>
-        <w:rPr>
-          <w:lang w:val="en-FI"/>
-        </w:rPr>
         <w:t>Results</w:t>
       </w:r>
     </w:p>
@@ -618,67 +615,34 @@
       </w:tr>
     </w:tbl>
     <w:p>
-      <w:pPr>
-        <w:rPr>
-          <w:lang w:val="en-FI"/>
-        </w:rPr>
-      </w:pPr>
-      <w:r>
-        <w:rPr>
-          <w:lang w:val="en-FI"/>
-        </w:rPr>
+      <w:r>
         <w:t xml:space="preserve">HVD took extremely long to process as well as DMP. </w:t>
       </w:r>
       <w:r>
-        <w:rPr>
-          <w:lang w:val="en-FI"/>
-        </w:rPr>
         <w:br/>
         <w:t>PD had the shortest run time.</w:t>
       </w:r>
       <w:r>
-        <w:rPr>
-          <w:lang w:val="en-FI"/>
-        </w:rPr>
         <w:br/>
         <w:t>When running all, the run time was over 10 minutes</w:t>
       </w:r>
       <w:r>
-        <w:rPr>
-          <w:lang w:val="en-FI"/>
-        </w:rPr>
         <w:t>.</w:t>
       </w:r>
       <w:r>
-        <w:rPr>
-          <w:lang w:val="en-FI"/>
-        </w:rPr>
         <w:br w:type="page"/>
       </w:r>
     </w:p>
     <w:p>
-      <w:pPr>
-        <w:rPr>
-          <w:lang w:val="en-FI"/>
-        </w:rPr>
-      </w:pPr>
-      <w:r>
-        <w:rPr>
-          <w:lang w:val="en-FI"/>
-        </w:rPr>
+      <w:r>
         <w:lastRenderedPageBreak/>
         <w:t>Iiro’s DMP heuristic</w:t>
       </w:r>
     </w:p>
     <w:p>
-      <w:pPr>
-        <w:rPr>
-          <w:lang w:val="en-FI"/>
-        </w:rPr>
-      </w:pPr>
-      <w:r>
-        <w:rPr>
-          <w:lang w:val="en-FI"/>
+      <w:r>
+        <w:rPr>
+          <w:noProof/>
         </w:rPr>
         <w:drawing>
           <wp:inline distT="0" distB="0" distL="0" distR="0" wp14:anchorId="7776A34F" wp14:editId="5FC572AC">
@@ -718,15 +682,7 @@
       </w:r>
     </w:p>
     <w:p>
-      <w:pPr>
-        <w:rPr>
-          <w:lang w:val="en-FI"/>
-        </w:rPr>
-      </w:pPr>
-      <w:r>
-        <w:rPr>
-          <w:lang w:val="en-FI"/>
-        </w:rPr>
+      <w:r>
         <w:t>Rasmus’ HVD</w:t>
       </w:r>
     </w:p>
@@ -738,6 +694,7 @@
       </w:pPr>
       <w:r>
         <w:rPr>
+          <w:noProof/>
           <w:lang w:val="en-GB"/>
         </w:rPr>
         <w:drawing>
@@ -798,6 +755,7 @@
       </w:pPr>
       <w:r>
         <w:rPr>
+          <w:noProof/>
           <w:lang w:val="en-GB"/>
         </w:rPr>
         <w:drawing>
@@ -1449,6 +1407,7 @@
   <w:style w:type="character" w:default="1" w:styleId="DefaultParagraphFont">
     <w:name w:val="Default Paragraph Font"/>
     <w:uiPriority w:val="1"/>
+    <w:semiHidden/>
     <w:unhideWhenUsed/>
   </w:style>
   <w:style w:type="table" w:default="1" w:styleId="TableNormal">

</xml_diff>